<commit_message>
Uploaded the docx file again as the previous one was the old one
</commit_message>
<xml_diff>
--- a/BushraMaaz_Version_Control_Doc_DBLab.pdf.docx
+++ b/BushraMaaz_Version_Control_Doc_DBLab.pdf.docx
@@ -1021,6 +1021,334 @@
           </w:p>
         </w:tc>
       </w:tr>
+      <w:tr>
+        <w:tblPrEx>
+          <w:tblBorders>
+            <w:top w:val="single" w:color="auto" w:sz="4" w:space="0"/>
+            <w:left w:val="single" w:color="auto" w:sz="4" w:space="0"/>
+            <w:bottom w:val="single" w:color="auto" w:sz="4" w:space="0"/>
+            <w:right w:val="single" w:color="auto" w:sz="4" w:space="0"/>
+            <w:insideH w:val="single" w:color="auto" w:sz="4" w:space="0"/>
+            <w:insideV w:val="single" w:color="auto" w:sz="4" w:space="0"/>
+          </w:tblBorders>
+          <w:tblCellMar>
+            <w:top w:w="0" w:type="dxa"/>
+            <w:left w:w="108" w:type="dxa"/>
+            <w:bottom w:w="0" w:type="dxa"/>
+            <w:right w:w="108" w:type="dxa"/>
+          </w:tblCellMar>
+        </w:tblPrEx>
+        <w:tc>
+          <w:tcPr>
+            <w:tcW w:w="1915" w:type="dxa"/>
+          </w:tcPr>
+          <w:p>
+            <w:pPr>
+              <w:widowControl w:val="0"/>
+              <w:spacing w:before="0" w:after="80"/>
+              <w:jc w:val="center"/>
+              <w:rPr>
+                <w:rFonts w:hint="default" w:ascii="Calibri" w:hAnsi="Calibri" w:eastAsia="SimSun" w:cs="Calibri"/>
+                <w:sz w:val="24"/>
+                <w:szCs w:val="24"/>
+                <w:lang w:val="en-US"/>
+              </w:rPr>
+            </w:pPr>
+            <w:r>
+              <w:rPr>
+                <w:rFonts w:hint="default" w:ascii="Calibri" w:hAnsi="Calibri" w:eastAsia="SimSun" w:cs="Calibri"/>
+                <w:sz w:val="24"/>
+                <w:szCs w:val="24"/>
+                <w:lang w:val="en-US"/>
+              </w:rPr>
+              <w:t>Workflow Diagram</w:t>
+            </w:r>
+          </w:p>
+        </w:tc>
+        <w:tc>
+          <w:tcPr>
+            <w:tcW w:w="1915" w:type="dxa"/>
+          </w:tcPr>
+          <w:p>
+            <w:pPr>
+              <w:widowControl w:val="0"/>
+              <w:spacing w:before="0" w:after="80"/>
+              <w:jc w:val="center"/>
+              <w:rPr>
+                <w:rFonts w:hint="default" w:ascii="Calibri" w:hAnsi="Calibri" w:eastAsia="SimSun" w:cs="Calibri"/>
+                <w:sz w:val="24"/>
+                <w:szCs w:val="24"/>
+                <w:lang w:val="en-US"/>
+              </w:rPr>
+            </w:pPr>
+            <w:r>
+              <w:rPr>
+                <w:rFonts w:hint="default" w:ascii="Calibri" w:hAnsi="Calibri" w:eastAsia="SimSun" w:cs="Calibri"/>
+                <w:sz w:val="24"/>
+                <w:szCs w:val="24"/>
+                <w:lang w:val="en-US"/>
+              </w:rPr>
+              <w:t>I made a workflow diagram and it shows the step by step working of the whole project</w:t>
+            </w:r>
+          </w:p>
+        </w:tc>
+        <w:tc>
+          <w:tcPr>
+            <w:tcW w:w="1915" w:type="dxa"/>
+          </w:tcPr>
+          <w:p>
+            <w:pPr>
+              <w:widowControl w:val="0"/>
+              <w:spacing w:before="0" w:after="80"/>
+              <w:jc w:val="center"/>
+              <w:rPr>
+                <w:rFonts w:hint="default"/>
+                <w:sz w:val="24"/>
+                <w:szCs w:val="24"/>
+                <w:vertAlign w:val="baseline"/>
+                <w:lang w:val="en-US"/>
+              </w:rPr>
+            </w:pPr>
+            <w:r>
+              <w:rPr>
+                <w:rFonts w:hint="default"/>
+                <w:sz w:val="24"/>
+                <w:szCs w:val="24"/>
+                <w:vertAlign w:val="baseline"/>
+                <w:lang w:val="en-US"/>
+              </w:rPr>
+              <w:t>1.3</w:t>
+            </w:r>
+          </w:p>
+        </w:tc>
+        <w:tc>
+          <w:tcPr>
+            <w:tcW w:w="1915" w:type="dxa"/>
+          </w:tcPr>
+          <w:p>
+            <w:pPr>
+              <w:widowControl w:val="0"/>
+              <w:spacing w:before="0" w:after="80"/>
+              <w:jc w:val="center"/>
+              <w:rPr>
+                <w:rFonts w:hint="default"/>
+                <w:sz w:val="24"/>
+                <w:szCs w:val="24"/>
+                <w:vertAlign w:val="baseline"/>
+                <w:lang w:val="en-US"/>
+              </w:rPr>
+            </w:pPr>
+            <w:r>
+              <w:rPr>
+                <w:rFonts w:hint="default"/>
+                <w:sz w:val="24"/>
+                <w:szCs w:val="24"/>
+                <w:vertAlign w:val="baseline"/>
+                <w:lang w:val="en-US"/>
+              </w:rPr>
+              <w:t>Completed</w:t>
+            </w:r>
+          </w:p>
+        </w:tc>
+        <w:tc>
+          <w:tcPr>
+            <w:tcW w:w="1915" w:type="dxa"/>
+          </w:tcPr>
+          <w:p>
+            <w:pPr>
+              <w:widowControl w:val="0"/>
+              <w:spacing w:before="0" w:after="80"/>
+              <w:jc w:val="center"/>
+              <w:rPr>
+                <w:rFonts w:hint="default"/>
+                <w:sz w:val="24"/>
+                <w:szCs w:val="24"/>
+                <w:vertAlign w:val="baseline"/>
+                <w:lang w:val="en-US"/>
+              </w:rPr>
+            </w:pPr>
+            <w:r>
+              <w:rPr>
+                <w:rFonts w:hint="default"/>
+                <w:sz w:val="24"/>
+                <w:szCs w:val="24"/>
+                <w:vertAlign w:val="baseline"/>
+                <w:lang w:val="en-US"/>
+              </w:rPr>
+              <w:t>(10 May 2026)</w:t>
+            </w:r>
+          </w:p>
+        </w:tc>
+      </w:tr>
+      <w:tr>
+        <w:tblPrEx>
+          <w:tblBorders>
+            <w:top w:val="single" w:color="auto" w:sz="4" w:space="0"/>
+            <w:left w:val="single" w:color="auto" w:sz="4" w:space="0"/>
+            <w:bottom w:val="single" w:color="auto" w:sz="4" w:space="0"/>
+            <w:right w:val="single" w:color="auto" w:sz="4" w:space="0"/>
+            <w:insideH w:val="single" w:color="auto" w:sz="4" w:space="0"/>
+            <w:insideV w:val="single" w:color="auto" w:sz="4" w:space="0"/>
+          </w:tblBorders>
+          <w:tblCellMar>
+            <w:top w:w="0" w:type="dxa"/>
+            <w:left w:w="108" w:type="dxa"/>
+            <w:bottom w:w="0" w:type="dxa"/>
+            <w:right w:w="108" w:type="dxa"/>
+          </w:tblCellMar>
+        </w:tblPrEx>
+        <w:tc>
+          <w:tcPr>
+            <w:tcW w:w="1915" w:type="dxa"/>
+            <w:shd w:val="clear"/>
+            <w:vAlign w:val="top"/>
+          </w:tcPr>
+          <w:p>
+            <w:pPr>
+              <w:widowControl w:val="0"/>
+              <w:spacing w:before="0" w:after="80"/>
+              <w:jc w:val="center"/>
+              <w:rPr>
+                <w:rFonts w:hint="default" w:ascii="Times New Roman" w:hAnsi="Times New Roman" w:eastAsia="Times New Roman" w:cs="Times New Roman"/>
+                <w:sz w:val="24"/>
+                <w:szCs w:val="24"/>
+                <w:vertAlign w:val="baseline"/>
+                <w:lang w:val="en-US"/>
+              </w:rPr>
+            </w:pPr>
+            <w:r>
+              <w:rPr>
+                <w:rFonts w:hint="default" w:ascii="Calibri" w:hAnsi="Calibri" w:eastAsia="SimSun" w:cs="Calibri"/>
+                <w:sz w:val="24"/>
+                <w:szCs w:val="24"/>
+              </w:rPr>
+              <w:t>Normalization</w:t>
+            </w:r>
+          </w:p>
+        </w:tc>
+        <w:tc>
+          <w:tcPr>
+            <w:tcW w:w="1915" w:type="dxa"/>
+            <w:shd w:val="clear"/>
+            <w:vAlign w:val="top"/>
+          </w:tcPr>
+          <w:p>
+            <w:pPr>
+              <w:widowControl w:val="0"/>
+              <w:spacing w:before="0" w:after="80"/>
+              <w:jc w:val="center"/>
+              <w:rPr>
+                <w:rFonts w:hint="default" w:ascii="Times New Roman" w:hAnsi="Times New Roman" w:eastAsia="Times New Roman" w:cs="Times New Roman"/>
+                <w:sz w:val="24"/>
+                <w:szCs w:val="24"/>
+                <w:vertAlign w:val="baseline"/>
+                <w:lang w:val="en-US"/>
+              </w:rPr>
+            </w:pPr>
+            <w:r>
+              <w:rPr>
+                <w:rFonts w:hint="default" w:ascii="Calibri" w:hAnsi="Calibri" w:eastAsia="SimSun" w:cs="Calibri"/>
+                <w:sz w:val="24"/>
+                <w:szCs w:val="24"/>
+              </w:rPr>
+              <w:t>Applied and verified 1NF, 2NF, and 3NF rules. Checked for redundancies and validated 1:1/1:N ERD relationships.</w:t>
+            </w:r>
+          </w:p>
+        </w:tc>
+        <w:tc>
+          <w:tcPr>
+            <w:tcW w:w="1915" w:type="dxa"/>
+            <w:shd w:val="clear"/>
+            <w:vAlign w:val="top"/>
+          </w:tcPr>
+          <w:p>
+            <w:pPr>
+              <w:widowControl w:val="0"/>
+              <w:spacing w:before="0" w:after="80"/>
+              <w:jc w:val="center"/>
+              <w:rPr>
+                <w:rFonts w:hint="default" w:ascii="Times New Roman" w:hAnsi="Times New Roman" w:eastAsia="Times New Roman" w:cs="Times New Roman"/>
+                <w:sz w:val="24"/>
+                <w:szCs w:val="24"/>
+                <w:vertAlign w:val="baseline"/>
+                <w:lang w:val="en-US"/>
+              </w:rPr>
+            </w:pPr>
+            <w:r>
+              <w:rPr>
+                <w:rFonts w:hint="default"/>
+                <w:sz w:val="24"/>
+                <w:szCs w:val="24"/>
+                <w:vertAlign w:val="baseline"/>
+                <w:lang w:val="en-US"/>
+              </w:rPr>
+              <w:t>1.4</w:t>
+            </w:r>
+          </w:p>
+        </w:tc>
+        <w:tc>
+          <w:tcPr>
+            <w:tcW w:w="1915" w:type="dxa"/>
+            <w:shd w:val="clear"/>
+            <w:vAlign w:val="top"/>
+          </w:tcPr>
+          <w:p>
+            <w:pPr>
+              <w:widowControl w:val="0"/>
+              <w:spacing w:before="0" w:after="80"/>
+              <w:jc w:val="center"/>
+              <w:rPr>
+                <w:rFonts w:hint="default" w:ascii="Times New Roman" w:hAnsi="Times New Roman" w:eastAsia="Times New Roman" w:cs="Times New Roman"/>
+                <w:sz w:val="24"/>
+                <w:szCs w:val="24"/>
+                <w:vertAlign w:val="baseline"/>
+                <w:lang w:val="en-US"/>
+              </w:rPr>
+            </w:pPr>
+            <w:r>
+              <w:rPr>
+                <w:rFonts w:hint="default"/>
+                <w:sz w:val="24"/>
+                <w:szCs w:val="24"/>
+                <w:vertAlign w:val="baseline"/>
+                <w:lang w:val="en-US"/>
+              </w:rPr>
+              <w:t>Completed</w:t>
+            </w:r>
+          </w:p>
+        </w:tc>
+        <w:tc>
+          <w:tcPr>
+            <w:tcW w:w="1915" w:type="dxa"/>
+            <w:shd w:val="clear"/>
+            <w:vAlign w:val="top"/>
+          </w:tcPr>
+          <w:p>
+            <w:pPr>
+              <w:widowControl w:val="0"/>
+              <w:spacing w:before="0" w:after="80"/>
+              <w:jc w:val="center"/>
+              <w:rPr>
+                <w:rFonts w:hint="default" w:ascii="Times New Roman" w:hAnsi="Times New Roman" w:eastAsia="Times New Roman" w:cs="Times New Roman"/>
+                <w:sz w:val="24"/>
+                <w:szCs w:val="24"/>
+                <w:vertAlign w:val="baseline"/>
+                <w:lang w:val="en-US"/>
+              </w:rPr>
+            </w:pPr>
+            <w:r>
+              <w:rPr>
+                <w:rFonts w:hint="default"/>
+                <w:sz w:val="24"/>
+                <w:szCs w:val="24"/>
+                <w:vertAlign w:val="baseline"/>
+                <w:lang w:val="en-US"/>
+              </w:rPr>
+              <w:t>(15 May 2026)</w:t>
+            </w:r>
+          </w:p>
+        </w:tc>
+      </w:tr>
     </w:tbl>
     <w:p>
       <w:pPr>
@@ -2875,32 +3203,6 @@
           <w:bCs/>
         </w:rPr>
         <w:br w:type="page"/>
-      </w:r>
-    </w:p>
-    <w:p>
-      <w:pPr>
-        <w:spacing w:before="0" w:after="0"/>
-        <w:rPr>
-          <w:rFonts w:hint="default"/>
-          <w:b/>
-          <w:bCs/>
-          <w:sz w:val="36"/>
-          <w:szCs w:val="36"/>
-          <w:u w:val="none"/>
-          <w:lang w:val="en-US"/>
-        </w:rPr>
-      </w:pPr>
-      <w:r>
-        <w:rPr>
-          <w:rFonts w:hint="default"/>
-          <w:b/>
-          <w:bCs/>
-          <w:sz w:val="36"/>
-          <w:szCs w:val="36"/>
-          <w:u w:val="none"/>
-          <w:lang w:val="en-US"/>
-        </w:rPr>
-        <w:t>Description of Schema</w:t>
       </w:r>
     </w:p>
     <w:p>
@@ -2916,28 +3218,41 @@
           <w:lang w:val="en-US"/>
         </w:rPr>
       </w:pPr>
-    </w:p>
-    <w:p>
-      <w:pPr>
-        <w:spacing w:before="0" w:after="0" w:line="360" w:lineRule="auto"/>
-        <w:rPr>
-          <w:rFonts w:hint="default" w:ascii="Times New Roman" w:hAnsi="Times New Roman" w:eastAsia="SimSun" w:cs="Times New Roman"/>
-          <w:sz w:val="24"/>
-          <w:szCs w:val="24"/>
-        </w:rPr>
-      </w:pPr>
-      <w:r>
-        <w:rPr>
-          <w:rFonts w:hint="default" w:ascii="Times New Roman" w:hAnsi="Times New Roman" w:eastAsia="SimSun" w:cs="Times New Roman"/>
-          <w:sz w:val="24"/>
-          <w:szCs w:val="24"/>
-        </w:rPr>
-        <w:t xml:space="preserve">The database has four tables. The </w:t>
-      </w:r>
-      <w:r>
-        <w:rPr>
-          <w:rStyle w:val="17"/>
-          <w:rFonts w:hint="default" w:ascii="Times New Roman" w:hAnsi="Times New Roman" w:eastAsia="SimSun" w:cs="Times New Roman"/>
+      <w:r>
+        <w:rPr>
+          <w:rFonts w:hint="default"/>
+          <w:b/>
+          <w:bCs/>
+          <w:sz w:val="36"/>
+          <w:szCs w:val="36"/>
+          <w:u w:val="none"/>
+          <w:lang w:val="en-US"/>
+        </w:rPr>
+        <w:t>Description of Schema</w:t>
+      </w:r>
+    </w:p>
+    <w:p>
+      <w:pPr>
+        <w:spacing w:before="0" w:after="0"/>
+        <w:rPr>
+          <w:rFonts w:hint="default" w:ascii="Calibri" w:hAnsi="Calibri" w:eastAsia="SimSun" w:cs="Calibri"/>
+          <w:sz w:val="24"/>
+          <w:szCs w:val="24"/>
+        </w:rPr>
+      </w:pPr>
+      <w:r>
+        <w:rPr>
+          <w:rFonts w:hint="default" w:ascii="Calibri" w:hAnsi="Calibri" w:eastAsia="SimSun" w:cs="Calibri"/>
+          <w:sz w:val="24"/>
+          <w:szCs w:val="24"/>
+        </w:rPr>
+        <w:t xml:space="preserve">The SecureVault database schema consists of nine interrelated tables designed to securely manage user credentials, configurations, and system activity. The </w:t>
+      </w:r>
+      <w:r>
+        <w:rPr>
+          <w:rFonts w:hint="default" w:ascii="Calibri" w:hAnsi="Calibri" w:eastAsia="SimSun" w:cs="Calibri"/>
+          <w:b/>
+          <w:bCs/>
           <w:sz w:val="24"/>
           <w:szCs w:val="24"/>
         </w:rPr>
@@ -2945,16 +3260,17 @@
       </w:r>
       <w:r>
         <w:rPr>
-          <w:rFonts w:hint="default" w:ascii="Times New Roman" w:hAnsi="Times New Roman" w:eastAsia="SimSun" w:cs="Times New Roman"/>
-          <w:sz w:val="24"/>
-          <w:szCs w:val="24"/>
-        </w:rPr>
-        <w:t xml:space="preserve"> table stores account information for each registered user, including their username and a hashed version of their master password. The </w:t>
-      </w:r>
-      <w:r>
-        <w:rPr>
-          <w:rStyle w:val="17"/>
-          <w:rFonts w:hint="default" w:ascii="Times New Roman" w:hAnsi="Times New Roman" w:eastAsia="SimSun" w:cs="Times New Roman"/>
+          <w:rFonts w:hint="default" w:ascii="Calibri" w:hAnsi="Calibri" w:eastAsia="SimSun" w:cs="Calibri"/>
+          <w:sz w:val="24"/>
+          <w:szCs w:val="24"/>
+        </w:rPr>
+        <w:t xml:space="preserve"> table acts as the central hub, storing essential account information including the username and a hashed version of the master password. The </w:t>
+      </w:r>
+      <w:r>
+        <w:rPr>
+          <w:rFonts w:hint="default" w:ascii="Calibri" w:hAnsi="Calibri" w:eastAsia="SimSun" w:cs="Calibri"/>
+          <w:b/>
+          <w:bCs/>
           <w:sz w:val="24"/>
           <w:szCs w:val="24"/>
         </w:rPr>
@@ -2962,16 +3278,89 @@
       </w:r>
       <w:r>
         <w:rPr>
-          <w:rFonts w:hint="default" w:ascii="Times New Roman" w:hAnsi="Times New Roman" w:eastAsia="SimSun" w:cs="Times New Roman"/>
-          <w:sz w:val="24"/>
-          <w:szCs w:val="24"/>
-        </w:rPr>
-        <w:t xml:space="preserve"> table holds the actual password entries, where each row stores encrypted credentials for a specific website and is linked to the user who owns it. The </w:t>
-      </w:r>
-      <w:r>
-        <w:rPr>
-          <w:rStyle w:val="17"/>
-          <w:rFonts w:hint="default" w:ascii="Times New Roman" w:hAnsi="Times New Roman" w:eastAsia="SimSun" w:cs="Times New Roman"/>
+          <w:rFonts w:hint="default" w:ascii="Calibri" w:hAnsi="Calibri" w:eastAsia="SimSun" w:cs="Calibri"/>
+          <w:sz w:val="24"/>
+          <w:szCs w:val="24"/>
+        </w:rPr>
+        <w:t xml:space="preserve"> table is the core storage entity, holding the actual encrypted passwords and website details linked to the user. To organize these entries, the </w:t>
+      </w:r>
+      <w:r>
+        <w:rPr>
+          <w:rFonts w:hint="default" w:ascii="Calibri" w:hAnsi="Calibri" w:eastAsia="SimSun" w:cs="Calibri"/>
+          <w:b/>
+          <w:bCs/>
+          <w:sz w:val="24"/>
+          <w:szCs w:val="24"/>
+        </w:rPr>
+        <w:t>credential_types</w:t>
+      </w:r>
+      <w:r>
+        <w:rPr>
+          <w:rFonts w:hint="default" w:ascii="Calibri" w:hAnsi="Calibri" w:eastAsia="SimSun" w:cs="Calibri"/>
+          <w:sz w:val="24"/>
+          <w:szCs w:val="24"/>
+        </w:rPr>
+        <w:t xml:space="preserve"> table categorizes them by security level and defines specific behaviors, such as clipboard timeouts. For specialized financial data, the </w:t>
+      </w:r>
+      <w:r>
+        <w:rPr>
+          <w:rFonts w:hint="default" w:ascii="Calibri" w:hAnsi="Calibri" w:eastAsia="SimSun" w:cs="Calibri"/>
+          <w:b/>
+          <w:bCs/>
+          <w:sz w:val="24"/>
+          <w:szCs w:val="24"/>
+        </w:rPr>
+        <w:t>bank_credentials</w:t>
+      </w:r>
+      <w:r>
+        <w:rPr>
+          <w:rFonts w:hint="default" w:ascii="Calibri" w:hAnsi="Calibri" w:eastAsia="SimSun" w:cs="Calibri"/>
+          <w:sz w:val="24"/>
+          <w:szCs w:val="24"/>
+        </w:rPr>
+        <w:t xml:space="preserve"> table isolates sensitive information like encrypted account numbers and PINs, linking directly to a specific vault entry. The system also maintains a secure archive of previously used passwords in the </w:t>
+      </w:r>
+      <w:r>
+        <w:rPr>
+          <w:rFonts w:hint="default" w:ascii="Calibri" w:hAnsi="Calibri" w:eastAsia="SimSun" w:cs="Calibri"/>
+          <w:b/>
+          <w:bCs/>
+          <w:sz w:val="24"/>
+          <w:szCs w:val="24"/>
+        </w:rPr>
+        <w:t>password_history</w:t>
+      </w:r>
+      <w:r>
+        <w:rPr>
+          <w:rFonts w:hint="default" w:ascii="Calibri" w:hAnsi="Calibri" w:eastAsia="SimSun" w:cs="Calibri"/>
+          <w:sz w:val="24"/>
+          <w:szCs w:val="24"/>
+        </w:rPr>
+        <w:t xml:space="preserve"> table. To manage the application experience, the </w:t>
+      </w:r>
+      <w:r>
+        <w:rPr>
+          <w:rFonts w:hint="default" w:ascii="Calibri" w:hAnsi="Calibri" w:eastAsia="SimSun" w:cs="Calibri"/>
+          <w:b/>
+          <w:bCs/>
+          <w:sz w:val="24"/>
+          <w:szCs w:val="24"/>
+        </w:rPr>
+        <w:t>user_preferences</w:t>
+      </w:r>
+      <w:r>
+        <w:rPr>
+          <w:rFonts w:hint="default" w:ascii="Calibri" w:hAnsi="Calibri" w:eastAsia="SimSun" w:cs="Calibri"/>
+          <w:sz w:val="24"/>
+          <w:szCs w:val="24"/>
+        </w:rPr>
+        <w:t xml:space="preserve"> table stores individual configurations such as UI themes and auto-logout timers. Finally, system security and monitoring are handled by three tables: </w:t>
+      </w:r>
+      <w:r>
+        <w:rPr>
+          <w:rFonts w:hint="default" w:ascii="Calibri" w:hAnsi="Calibri" w:eastAsia="SimSun" w:cs="Calibri"/>
+          <w:b/>
+          <w:bCs/>
           <w:sz w:val="24"/>
           <w:szCs w:val="24"/>
         </w:rPr>
@@ -2979,16 +3368,35 @@
       </w:r>
       <w:r>
         <w:rPr>
-          <w:rFonts w:hint="default" w:ascii="Times New Roman" w:hAnsi="Times New Roman" w:eastAsia="SimSun" w:cs="Times New Roman"/>
-          <w:sz w:val="24"/>
-          <w:szCs w:val="24"/>
-        </w:rPr>
-        <w:t xml:space="preserve"> table keeps track of active logins by storing a session token for each user along with when it was created and when it expires. The </w:t>
-      </w:r>
-      <w:r>
-        <w:rPr>
-          <w:rStyle w:val="17"/>
-          <w:rFonts w:hint="default" w:ascii="Times New Roman" w:hAnsi="Times New Roman" w:eastAsia="SimSun" w:cs="Times New Roman"/>
+          <w:rFonts w:hint="default" w:ascii="Calibri" w:hAnsi="Calibri" w:eastAsia="SimSun" w:cs="Calibri"/>
+          <w:sz w:val="24"/>
+          <w:szCs w:val="24"/>
+        </w:rPr>
+        <w:t xml:space="preserve"> manages active login tokens and their expiration times , </w:t>
+      </w:r>
+      <w:r>
+        <w:rPr>
+          <w:rFonts w:hint="default" w:ascii="Calibri" w:hAnsi="Calibri" w:eastAsia="SimSun" w:cs="Calibri"/>
+          <w:b/>
+          <w:bCs/>
+          <w:sz w:val="24"/>
+          <w:szCs w:val="24"/>
+        </w:rPr>
+        <w:t>failed_login_attempts</w:t>
+      </w:r>
+      <w:r>
+        <w:rPr>
+          <w:rFonts w:hint="default" w:ascii="Calibri" w:hAnsi="Calibri" w:eastAsia="SimSun" w:cs="Calibri"/>
+          <w:sz w:val="24"/>
+          <w:szCs w:val="24"/>
+        </w:rPr>
+        <w:t xml:space="preserve"> logs unauthorized access attempts to detect potential breaches , and the </w:t>
+      </w:r>
+      <w:r>
+        <w:rPr>
+          <w:rFonts w:hint="default" w:ascii="Calibri" w:hAnsi="Calibri" w:eastAsia="SimSun" w:cs="Calibri"/>
+          <w:b/>
+          <w:bCs/>
           <w:sz w:val="24"/>
           <w:szCs w:val="24"/>
         </w:rPr>
@@ -2996,22 +3404,12 @@
       </w:r>
       <w:r>
         <w:rPr>
-          <w:rFonts w:hint="default" w:ascii="Times New Roman" w:hAnsi="Times New Roman" w:eastAsia="SimSun" w:cs="Times New Roman"/>
-          <w:sz w:val="24"/>
-          <w:szCs w:val="24"/>
-        </w:rPr>
-        <w:t xml:space="preserve"> table records every action a user performs in the system, such as adding or deleting a password, so there is a complete history of activity.</w:t>
-      </w:r>
-    </w:p>
-    <w:p>
-      <w:pPr>
-        <w:spacing w:before="0" w:after="0"/>
-        <w:rPr>
-          <w:rFonts w:hint="default" w:ascii="Times New Roman" w:hAnsi="Times New Roman" w:eastAsia="SimSun" w:cs="Times New Roman"/>
-          <w:sz w:val="24"/>
-          <w:szCs w:val="24"/>
-        </w:rPr>
-      </w:pPr>
+          <w:rFonts w:hint="default" w:ascii="Calibri" w:hAnsi="Calibri" w:eastAsia="SimSun" w:cs="Calibri"/>
+          <w:sz w:val="24"/>
+          <w:szCs w:val="24"/>
+        </w:rPr>
+        <w:t xml:space="preserve"> provides a comprehensive, traceable history of every action a user performs within the system</w:t>
+      </w:r>
     </w:p>
     <w:p>
       <w:pPr>
@@ -3025,7 +3423,10 @@
           <w:lang w:val="en-US"/>
         </w:rPr>
       </w:pPr>
-      <w:r>
+    </w:p>
+    <w:p>
+      <w:pPr>
+        <w:spacing w:before="0" w:after="0"/>
         <w:rPr>
           <w:rFonts w:hint="default" w:ascii="Times New Roman" w:hAnsi="Times New Roman" w:eastAsia="SimSun" w:cs="Times New Roman"/>
           <w:b/>
@@ -3034,8 +3435,7 @@
           <w:szCs w:val="36"/>
           <w:lang w:val="en-US"/>
         </w:rPr>
-        <w:t>ERD (Entity Relation Diagram)</w:t>
-      </w:r>
+      </w:pPr>
     </w:p>
     <w:p>
       <w:pPr>
@@ -3049,6 +3449,238 @@
           <w:lang w:val="en-US"/>
         </w:rPr>
       </w:pPr>
+    </w:p>
+    <w:p>
+      <w:pPr>
+        <w:spacing w:before="0" w:after="0"/>
+        <w:rPr>
+          <w:rFonts w:hint="default" w:ascii="Times New Roman" w:hAnsi="Times New Roman" w:eastAsia="SimSun" w:cs="Times New Roman"/>
+          <w:b/>
+          <w:bCs/>
+          <w:sz w:val="36"/>
+          <w:szCs w:val="36"/>
+          <w:lang w:val="en-US"/>
+        </w:rPr>
+      </w:pPr>
+    </w:p>
+    <w:p>
+      <w:pPr>
+        <w:spacing w:before="0" w:after="0"/>
+        <w:rPr>
+          <w:rFonts w:hint="default" w:ascii="Times New Roman" w:hAnsi="Times New Roman" w:eastAsia="SimSun" w:cs="Times New Roman"/>
+          <w:b/>
+          <w:bCs/>
+          <w:sz w:val="36"/>
+          <w:szCs w:val="36"/>
+          <w:lang w:val="en-US"/>
+        </w:rPr>
+      </w:pPr>
+    </w:p>
+    <w:p>
+      <w:pPr>
+        <w:spacing w:before="0" w:after="0"/>
+        <w:rPr>
+          <w:rFonts w:hint="default" w:ascii="Times New Roman" w:hAnsi="Times New Roman" w:eastAsia="SimSun" w:cs="Times New Roman"/>
+          <w:b/>
+          <w:bCs/>
+          <w:sz w:val="36"/>
+          <w:szCs w:val="36"/>
+          <w:lang w:val="en-US"/>
+        </w:rPr>
+      </w:pPr>
+    </w:p>
+    <w:p>
+      <w:pPr>
+        <w:spacing w:before="0" w:after="0"/>
+        <w:rPr>
+          <w:rFonts w:hint="default" w:ascii="Times New Roman" w:hAnsi="Times New Roman" w:eastAsia="SimSun" w:cs="Times New Roman"/>
+          <w:b/>
+          <w:bCs/>
+          <w:sz w:val="36"/>
+          <w:szCs w:val="36"/>
+          <w:lang w:val="en-US"/>
+        </w:rPr>
+      </w:pPr>
+    </w:p>
+    <w:p>
+      <w:pPr>
+        <w:spacing w:before="0" w:after="0"/>
+        <w:rPr>
+          <w:rFonts w:hint="default" w:ascii="Times New Roman" w:hAnsi="Times New Roman" w:eastAsia="SimSun" w:cs="Times New Roman"/>
+          <w:b/>
+          <w:bCs/>
+          <w:sz w:val="36"/>
+          <w:szCs w:val="36"/>
+          <w:lang w:val="en-US"/>
+        </w:rPr>
+      </w:pPr>
+    </w:p>
+    <w:p>
+      <w:pPr>
+        <w:spacing w:before="0" w:after="0"/>
+        <w:rPr>
+          <w:rFonts w:hint="default" w:ascii="Times New Roman" w:hAnsi="Times New Roman" w:eastAsia="SimSun" w:cs="Times New Roman"/>
+          <w:b/>
+          <w:bCs/>
+          <w:sz w:val="36"/>
+          <w:szCs w:val="36"/>
+          <w:lang w:val="en-US"/>
+        </w:rPr>
+      </w:pPr>
+    </w:p>
+    <w:p>
+      <w:pPr>
+        <w:spacing w:before="0" w:after="0"/>
+        <w:rPr>
+          <w:rFonts w:hint="default" w:ascii="Times New Roman" w:hAnsi="Times New Roman" w:eastAsia="SimSun" w:cs="Times New Roman"/>
+          <w:b/>
+          <w:bCs/>
+          <w:sz w:val="36"/>
+          <w:szCs w:val="36"/>
+          <w:lang w:val="en-US"/>
+        </w:rPr>
+      </w:pPr>
+    </w:p>
+    <w:p>
+      <w:pPr>
+        <w:spacing w:before="0" w:after="0"/>
+        <w:rPr>
+          <w:rFonts w:hint="default" w:ascii="Times New Roman" w:hAnsi="Times New Roman" w:eastAsia="SimSun" w:cs="Times New Roman"/>
+          <w:b/>
+          <w:bCs/>
+          <w:sz w:val="36"/>
+          <w:szCs w:val="36"/>
+          <w:lang w:val="en-US"/>
+        </w:rPr>
+      </w:pPr>
+    </w:p>
+    <w:p>
+      <w:pPr>
+        <w:spacing w:before="0" w:after="0"/>
+        <w:rPr>
+          <w:rFonts w:hint="default" w:ascii="Times New Roman" w:hAnsi="Times New Roman" w:eastAsia="SimSun" w:cs="Times New Roman"/>
+          <w:b/>
+          <w:bCs/>
+          <w:sz w:val="36"/>
+          <w:szCs w:val="36"/>
+          <w:lang w:val="en-US"/>
+        </w:rPr>
+      </w:pPr>
+    </w:p>
+    <w:p>
+      <w:pPr>
+        <w:spacing w:before="0" w:after="0"/>
+        <w:rPr>
+          <w:rFonts w:hint="default" w:ascii="Times New Roman" w:hAnsi="Times New Roman" w:eastAsia="SimSun" w:cs="Times New Roman"/>
+          <w:b/>
+          <w:bCs/>
+          <w:sz w:val="36"/>
+          <w:szCs w:val="36"/>
+          <w:lang w:val="en-US"/>
+        </w:rPr>
+      </w:pPr>
+    </w:p>
+    <w:p>
+      <w:pPr>
+        <w:spacing w:before="0" w:after="0"/>
+        <w:rPr>
+          <w:rFonts w:hint="default" w:ascii="Times New Roman" w:hAnsi="Times New Roman" w:eastAsia="SimSun" w:cs="Times New Roman"/>
+          <w:b/>
+          <w:bCs/>
+          <w:sz w:val="36"/>
+          <w:szCs w:val="36"/>
+          <w:lang w:val="en-US"/>
+        </w:rPr>
+      </w:pPr>
+    </w:p>
+    <w:p>
+      <w:pPr>
+        <w:spacing w:before="0" w:after="0"/>
+        <w:rPr>
+          <w:rFonts w:hint="default" w:ascii="Times New Roman" w:hAnsi="Times New Roman" w:eastAsia="SimSun" w:cs="Times New Roman"/>
+          <w:b/>
+          <w:bCs/>
+          <w:sz w:val="36"/>
+          <w:szCs w:val="36"/>
+          <w:lang w:val="en-US"/>
+        </w:rPr>
+      </w:pPr>
+    </w:p>
+    <w:p>
+      <w:pPr>
+        <w:spacing w:before="0" w:after="0"/>
+        <w:rPr>
+          <w:rFonts w:hint="default" w:ascii="Times New Roman" w:hAnsi="Times New Roman" w:eastAsia="SimSun" w:cs="Times New Roman"/>
+          <w:b/>
+          <w:bCs/>
+          <w:sz w:val="36"/>
+          <w:szCs w:val="36"/>
+          <w:lang w:val="en-US"/>
+        </w:rPr>
+      </w:pPr>
+    </w:p>
+    <w:p>
+      <w:pPr>
+        <w:spacing w:before="0" w:after="0"/>
+        <w:rPr>
+          <w:rFonts w:hint="default" w:ascii="Times New Roman" w:hAnsi="Times New Roman" w:eastAsia="SimSun" w:cs="Times New Roman"/>
+          <w:b/>
+          <w:bCs/>
+          <w:sz w:val="36"/>
+          <w:szCs w:val="36"/>
+          <w:lang w:val="en-US"/>
+        </w:rPr>
+      </w:pPr>
+    </w:p>
+    <w:p>
+      <w:pPr>
+        <w:spacing w:before="0" w:after="0"/>
+        <w:rPr>
+          <w:rFonts w:hint="default" w:ascii="Times New Roman" w:hAnsi="Times New Roman" w:eastAsia="SimSun" w:cs="Times New Roman"/>
+          <w:b/>
+          <w:bCs/>
+          <w:sz w:val="36"/>
+          <w:szCs w:val="36"/>
+          <w:lang w:val="en-US"/>
+        </w:rPr>
+      </w:pPr>
+    </w:p>
+    <w:p>
+      <w:pPr>
+        <w:spacing w:before="0" w:after="0"/>
+        <w:rPr>
+          <w:rFonts w:hint="default" w:ascii="Times New Roman" w:hAnsi="Times New Roman" w:eastAsia="SimSun" w:cs="Times New Roman"/>
+          <w:b/>
+          <w:bCs/>
+          <w:sz w:val="36"/>
+          <w:szCs w:val="36"/>
+          <w:lang w:val="en-US"/>
+        </w:rPr>
+      </w:pPr>
+    </w:p>
+    <w:p>
+      <w:pPr>
+        <w:spacing w:before="0" w:after="0"/>
+        <w:rPr>
+          <w:rFonts w:hint="default" w:ascii="Times New Roman" w:hAnsi="Times New Roman" w:eastAsia="SimSun" w:cs="Times New Roman"/>
+          <w:b/>
+          <w:bCs/>
+          <w:sz w:val="36"/>
+          <w:szCs w:val="36"/>
+          <w:lang w:val="en-US"/>
+        </w:rPr>
+      </w:pPr>
+      <w:r>
+        <w:rPr>
+          <w:rFonts w:hint="default" w:ascii="Times New Roman" w:hAnsi="Times New Roman" w:eastAsia="SimSun" w:cs="Times New Roman"/>
+          <w:b/>
+          <w:bCs/>
+          <w:sz w:val="36"/>
+          <w:szCs w:val="36"/>
+          <w:lang w:val="en-US"/>
+        </w:rPr>
+        <w:t>ERD (Entity Relation Diagram)</w:t>
+      </w:r>
     </w:p>
     <w:p>
       <w:pPr>
@@ -4104,7 +4736,130 @@
         </w:rPr>
         <w:t xml:space="preserve"> : one-to-one — each user has one preference configuration</w:t>
       </w:r>
+    </w:p>
+    <w:p>
+      <w:pPr>
+        <w:rPr>
+          <w:rFonts w:hint="default" w:ascii="Times New Roman" w:hAnsi="Times New Roman" w:eastAsia="SimSun" w:cs="Times New Roman"/>
+          <w:b/>
+          <w:bCs/>
+          <w:sz w:val="36"/>
+          <w:szCs w:val="36"/>
+          <w:lang w:val="en-US"/>
+        </w:rPr>
+      </w:pPr>
+      <w:r>
+        <w:rPr>
+          <w:rFonts w:hint="default" w:ascii="Times New Roman" w:hAnsi="Times New Roman" w:eastAsia="SimSun" w:cs="Times New Roman"/>
+          <w:b/>
+          <w:bCs/>
+          <w:sz w:val="36"/>
+          <w:szCs w:val="36"/>
+          <w:lang w:val="en-US"/>
+        </w:rPr>
+        <w:br w:type="page"/>
+      </w:r>
+    </w:p>
+    <w:p>
+      <w:pPr>
+        <w:keepNext w:val="0"/>
+        <w:keepLines w:val="0"/>
+        <w:widowControl/>
+        <w:numPr>
+          <w:numId w:val="0"/>
+        </w:numPr>
+        <w:suppressLineNumbers w:val="0"/>
+        <w:spacing w:before="0" w:beforeAutospacing="1" w:after="0" w:afterAutospacing="1"/>
+        <w:ind w:left="360" w:leftChars="0"/>
+        <w:rPr>
+          <w:rFonts w:hint="default" w:eastAsia="SimSun" w:cs="Times New Roman"/>
+          <w:b/>
+          <w:bCs/>
+          <w:sz w:val="36"/>
+          <w:szCs w:val="36"/>
+          <w:lang w:val="en-US"/>
+        </w:rPr>
+      </w:pPr>
+      <w:r>
+        <w:rPr>
+          <w:rFonts w:hint="default" w:eastAsia="SimSun" w:cs="Times New Roman"/>
+          <w:b/>
+          <w:bCs/>
+          <w:sz w:val="36"/>
+          <w:szCs w:val="36"/>
+          <w:lang w:val="en-US"/>
+        </w:rPr>
+        <w:t>WorkFlow Diagram</w:t>
+      </w:r>
+    </w:p>
+    <w:p>
+      <w:pPr>
+        <w:keepNext w:val="0"/>
+        <w:keepLines w:val="0"/>
+        <w:widowControl/>
+        <w:numPr>
+          <w:numId w:val="0"/>
+        </w:numPr>
+        <w:suppressLineNumbers w:val="0"/>
+        <w:spacing w:before="0" w:beforeAutospacing="1" w:after="0" w:afterAutospacing="1"/>
+        <w:ind w:left="360" w:leftChars="0"/>
+        <w:rPr>
+          <w:rFonts w:hint="default" w:eastAsia="SimSun" w:cs="Times New Roman"/>
+          <w:b/>
+          <w:bCs/>
+          <w:sz w:val="36"/>
+          <w:szCs w:val="36"/>
+          <w:lang w:val="en-US"/>
+        </w:rPr>
+      </w:pPr>
       <w:bookmarkStart w:id="0" w:name="_GoBack"/>
+      <w:r>
+        <w:rPr>
+          <w:rFonts w:hint="default" w:eastAsia="SimSun" w:cs="Times New Roman"/>
+          <w:b/>
+          <w:bCs/>
+          <w:sz w:val="36"/>
+          <w:szCs w:val="36"/>
+          <w:lang w:val="en-US"/>
+        </w:rPr>
+        <w:drawing>
+          <wp:inline distT="0" distB="0" distL="114300" distR="114300">
+            <wp:extent cx="5478780" cy="7600315"/>
+            <wp:effectExtent l="0" t="0" r="7620" b="0"/>
+            <wp:docPr id="3" name="Picture 3" descr="845246a1-c5c5-4e73-85ac-deca7f4c6c6d"/>
+            <wp:cNvGraphicFramePr>
+              <a:graphicFrameLocks xmlns:a="http://schemas.openxmlformats.org/drawingml/2006/main" noChangeAspect="1"/>
+            </wp:cNvGraphicFramePr>
+            <a:graphic xmlns:a="http://schemas.openxmlformats.org/drawingml/2006/main">
+              <a:graphicData uri="http://schemas.openxmlformats.org/drawingml/2006/picture">
+                <pic:pic xmlns:pic="http://schemas.openxmlformats.org/drawingml/2006/picture">
+                  <pic:nvPicPr>
+                    <pic:cNvPr id="3" name="Picture 3" descr="845246a1-c5c5-4e73-85ac-deca7f4c6c6d"/>
+                    <pic:cNvPicPr>
+                      <a:picLocks noChangeAspect="1"/>
+                    </pic:cNvPicPr>
+                  </pic:nvPicPr>
+                  <pic:blipFill>
+                    <a:blip r:embed="rId6"/>
+                    <a:stretch>
+                      <a:fillRect/>
+                    </a:stretch>
+                  </pic:blipFill>
+                  <pic:spPr>
+                    <a:xfrm>
+                      <a:off x="0" y="0"/>
+                      <a:ext cx="5478780" cy="7600315"/>
+                    </a:xfrm>
+                    <a:prstGeom prst="rect">
+                      <a:avLst/>
+                    </a:prstGeom>
+                  </pic:spPr>
+                </pic:pic>
+              </a:graphicData>
+            </a:graphic>
+          </wp:inline>
+        </w:drawing>
+      </w:r>
       <w:bookmarkEnd w:id="0"/>
     </w:p>
     <w:sectPr>

</xml_diff>